<commit_message>
Expand discovery to parse DNS handles and other account identifiers
</commit_message>
<xml_diff>
--- a/Outputs/Documents/Word/hallambaker-mesh-1-architecture.docx
+++ b/Outputs/Documents/Word/hallambaker-mesh-1-architecture.docx
@@ -1,6 +1,6 @@
 
 <file path=word/document.xml><?xml version="1.0" encoding="utf-8"?>
-<w:document xmlns:wpc="http://schemas.microsoft.com/office/word/2010/wordprocessingCanvas" xmlns:cx="http://schemas.microsoft.com/office/drawing/2014/chartex" xmlns:cx1="http://schemas.microsoft.com/office/drawing/2015/9/8/chartex" xmlns:cx2="http://schemas.microsoft.com/office/drawing/2015/10/21/chartex" xmlns:cx3="http://schemas.microsoft.com/office/drawing/2016/5/9/chartex" xmlns:cx4="http://schemas.microsoft.com/office/drawing/2016/5/10/chartex" xmlns:cx5="http://schemas.microsoft.com/office/drawing/2016/5/11/chartex" xmlns:cx6="http://schemas.microsoft.com/office/drawing/2016/5/12/chartex" xmlns:cx7="http://schemas.microsoft.com/office/drawing/2016/5/13/chartex" xmlns:cx8="http://schemas.microsoft.com/office/drawing/2016/5/14/chartex" xmlns:mc="http://schemas.openxmlformats.org/markup-compatibility/2006" xmlns:aink="http://schemas.microsoft.com/office/drawing/2016/ink" xmlns:am3d="http://schemas.microsoft.com/office/drawing/2017/model3d" xmlns:o="urn:schemas-microsoft-com:office:office" xmlns:oel="http://schemas.microsoft.com/office/2019/extlst" xmlns:r="http://schemas.openxmlformats.org/officeDocument/2006/relationships" xmlns:m="http://schemas.openxmlformats.org/officeDocument/2006/math" xmlns:v="urn:schemas-microsoft-com:vml" xmlns:wp14="http://schemas.microsoft.com/office/word/2010/wordprocessingDrawing" xmlns:wp="http://schemas.openxmlformats.org/drawingml/2006/wordprocessingDrawing" xmlns:w10="urn:schemas-microsoft-com:office:word" xmlns:w="http://schemas.openxmlformats.org/wordprocessingml/2006/main" xmlns:w14="http://schemas.microsoft.com/office/word/2010/wordml" xmlns:w15="http://schemas.microsoft.com/office/word/2012/wordml" xmlns:w16cex="http://schemas.microsoft.com/office/word/2018/wordml/cex" xmlns:w16cid="http://schemas.microsoft.com/office/word/2016/wordml/cid" xmlns:w16="http://schemas.microsoft.com/office/word/2018/wordml" xmlns:w16du="http://schemas.microsoft.com/office/word/2023/wordml/word16du" xmlns:w16sdtdh="http://schemas.microsoft.com/office/word/2020/wordml/sdtdatahash" xmlns:w16se="http://schemas.microsoft.com/office/word/2015/wordml/symex" xmlns:wpg="http://schemas.microsoft.com/office/word/2010/wordprocessingGroup" xmlns:wpi="http://schemas.microsoft.com/office/word/2010/wordprocessingInk" xmlns:wne="http://schemas.microsoft.com/office/word/2006/wordml" xmlns:wps="http://schemas.microsoft.com/office/word/2010/wordprocessingShape" mc:Ignorable="w14 w15 w16se w16cid w16 w16cex w16sdtdh w16du wp14">
+<w:document xmlns:wpc="http://schemas.microsoft.com/office/word/2010/wordprocessingCanvas" xmlns:cx="http://schemas.microsoft.com/office/drawing/2014/chartex" xmlns:cx1="http://schemas.microsoft.com/office/drawing/2015/9/8/chartex" xmlns:cx2="http://schemas.microsoft.com/office/drawing/2015/10/21/chartex" xmlns:cx3="http://schemas.microsoft.com/office/drawing/2016/5/9/chartex" xmlns:cx4="http://schemas.microsoft.com/office/drawing/2016/5/10/chartex" xmlns:cx5="http://schemas.microsoft.com/office/drawing/2016/5/11/chartex" xmlns:cx6="http://schemas.microsoft.com/office/drawing/2016/5/12/chartex" xmlns:cx7="http://schemas.microsoft.com/office/drawing/2016/5/13/chartex" xmlns:cx8="http://schemas.microsoft.com/office/drawing/2016/5/14/chartex" xmlns:mc="http://schemas.openxmlformats.org/markup-compatibility/2006" xmlns:aink="http://schemas.microsoft.com/office/drawing/2016/ink" xmlns:am3d="http://schemas.microsoft.com/office/drawing/2017/model3d" xmlns:o="urn:schemas-microsoft-com:office:office" xmlns:oel="http://schemas.microsoft.com/office/2019/extlst" xmlns:r="http://schemas.openxmlformats.org/officeDocument/2006/relationships" xmlns:m="http://schemas.openxmlformats.org/officeDocument/2006/math" xmlns:v="urn:schemas-microsoft-com:vml" xmlns:wp14="http://schemas.microsoft.com/office/word/2010/wordprocessingDrawing" xmlns:wp="http://schemas.openxmlformats.org/drawingml/2006/wordprocessingDrawing" xmlns:w10="urn:schemas-microsoft-com:office:word" xmlns:w="http://schemas.openxmlformats.org/wordprocessingml/2006/main" xmlns:w14="http://schemas.microsoft.com/office/word/2010/wordml" xmlns:w15="http://schemas.microsoft.com/office/word/2012/wordml" xmlns:w16cex="http://schemas.microsoft.com/office/word/2018/wordml/cex" xmlns:w16cid="http://schemas.microsoft.com/office/word/2016/wordml/cid" xmlns:w16="http://schemas.microsoft.com/office/word/2018/wordml" xmlns:w16du="http://schemas.microsoft.com/office/word/2023/wordml/word16du" xmlns:w16sdtdh="http://schemas.microsoft.com/office/word/2020/wordml/sdtdatahash" xmlns:w16sdtfl="http://schemas.microsoft.com/office/word/2024/wordml/sdtformatlock" xmlns:w16se="http://schemas.microsoft.com/office/word/2015/wordml/symex" xmlns:wpg="http://schemas.microsoft.com/office/word/2010/wordprocessingGroup" xmlns:wpi="http://schemas.microsoft.com/office/word/2010/wordprocessingInk" xmlns:wne="http://schemas.microsoft.com/office/word/2006/wordml" xmlns:wps="http://schemas.microsoft.com/office/word/2010/wordprocessingShape" mc:Ignorable="w14 w15 w16se w16cid w16 w16cex w16sdtdh w16sdtfl w16du wp14">
   <w:body>
     <w:p>
       <w:pPr>
@@ -2108,7 +2108,7 @@
         <w:pStyle w:val="Heading2"/>
       </w:pPr>
       <w:r>
-        <w:t>Mesh Service Provider</w:t>
+        <w:t>Open Service Model</w:t>
       </w:r>
     </w:p>
     <w:p>
@@ -2383,6 +2383,374 @@
         <w:pStyle w:val="Heading2"/>
       </w:pPr>
       <w:r>
+        <w:t>Names</w:t>
+      </w:r>
+    </w:p>
+    <w:p>
+      <w:r>
+        <w:t>Multiple identifiers are use</w:t>
+      </w:r>
+      <w:r>
+        <w:t>d</w:t>
+      </w:r>
+      <w:r>
+        <w:t xml:space="preserve"> to identify Mesh Accounts</w:t>
+      </w:r>
+      <w:r>
+        <w:t xml:space="preserve"> in different contexts according to specific needs. </w:t>
+      </w:r>
+      <w:r>
+        <w:t xml:space="preserve">For most purposes, users need only be aware of two of these types, Account Service Addresses that follow the </w:t>
+      </w:r>
+      <w:r>
+        <w:rPr>
+          <w:u w:val="single"/>
+        </w:rPr>
+        <w:t>&lt;&lt;user&gt;@&lt;&lt;</w:t>
+      </w:r>
+      <w:r>
+        <w:rPr>
+          <w:u w:val="single"/>
+        </w:rPr>
+        <w:t>msp-</w:t>
+      </w:r>
+      <w:r>
+        <w:rPr>
+          <w:u w:val="single"/>
+        </w:rPr>
+        <w:t>domain&gt;</w:t>
+      </w:r>
+      <w:r>
+        <w:t xml:space="preserve"> form introduced by SMTP and DNS Handles </w:t>
+      </w:r>
+      <w:r>
+        <w:rPr>
+          <w:u w:val="single"/>
+        </w:rPr>
+        <w:t>@&lt;&lt;</w:t>
+      </w:r>
+      <w:r>
+        <w:rPr>
+          <w:u w:val="single"/>
+        </w:rPr>
+        <w:t>user-</w:t>
+      </w:r>
+      <w:r>
+        <w:rPr>
+          <w:u w:val="single"/>
+        </w:rPr>
+        <w:t>domain&gt;</w:t>
+      </w:r>
+      <w:r>
+        <w:t>.</w:t>
+      </w:r>
+    </w:p>
+    <w:p>
+      <w:r>
+        <w:t xml:space="preserve">These identifier forms are both aliases for the Direct Service Address which has the form </w:t>
+      </w:r>
+      <w:r>
+        <w:rPr>
+          <w:u w:val="single"/>
+        </w:rPr>
+        <w:t>&lt;&lt;</w:t>
+      </w:r>
+      <w:r>
+        <w:rPr>
+          <w:u w:val="single"/>
+        </w:rPr>
+        <w:t>digest</w:t>
+      </w:r>
+      <w:r>
+        <w:rPr>
+          <w:u w:val="single"/>
+        </w:rPr>
+        <w:t>&gt;@&lt;&lt;</w:t>
+      </w:r>
+      <w:r>
+        <w:rPr>
+          <w:u w:val="single"/>
+        </w:rPr>
+        <w:t>msp-</w:t>
+      </w:r>
+      <w:r>
+        <w:rPr>
+          <w:u w:val="single"/>
+        </w:rPr>
+        <w:t>domain&gt;</w:t>
+      </w:r>
+      <w:r>
+        <w:t xml:space="preserve"> where &lt;&lt;digest&gt; is the UDF fingerprint of the account profile root of trust. </w:t>
+      </w:r>
+      <w:r>
+        <w:t>Thus, all four of the following might be identifiers for Alice's account:</w:t>
+      </w:r>
+    </w:p>
+    <w:p>
+      <w:pPr>
+        <w:pStyle w:val="PRE"/>
+      </w:pPr>
+      <w:r>
+        <w:t>@therealalice.example</w:t>
+      </w:r>
+      <w:r>
+        <w:br/>
+        <w:t>@</w:t>
+      </w:r>
+      <w:r>
+        <w:t>maua-f6qe-ejui-gbwr-c4bh-4x5o-tlah</w:t>
+      </w:r>
+      <w:r>
+        <w:t>@therealalice.example</w:t>
+      </w:r>
+      <w:r>
+        <w:br/>
+        <w:t>alice@example.com</w:t>
+      </w:r>
+      <w:r>
+        <w:br/>
+      </w:r>
+      <w:r>
+        <w:t>maua-f6qe-ejui-gbwr-c4bh-4x5o-tlah@example.com</w:t>
+      </w:r>
+    </w:p>
+    <w:p>
+      <w:r>
+        <w:t>As explained below, the first identifier form, @therealalice.example is likely th</w:t>
+      </w:r>
+      <w:r>
+        <w:t>e only one Alice needs in normal use</w:t>
+      </w:r>
+      <w:r>
+        <w:t xml:space="preserve">. The second is a form </w:t>
+      </w:r>
+      <w:r>
+        <w:t>Alice</w:t>
+      </w:r>
+      <w:r>
+        <w:t xml:space="preserve"> might use when a self-authenticating</w:t>
+      </w:r>
+      <w:r>
+        <w:t xml:space="preserve"> credential is required</w:t>
+      </w:r>
+      <w:r>
+        <w:t xml:space="preserve"> such as ensuring that end-to-end encrypted communications are end-to-end trusted</w:t>
+      </w:r>
+      <w:r>
+        <w:t>. The other identifier forms are only used internally or</w:t>
+      </w:r>
+      <w:r>
+        <w:t xml:space="preserve"> during manual configuration.</w:t>
+      </w:r>
+    </w:p>
+    <w:p>
+      <w:r>
+        <w:t>Account Service Addresses</w:t>
+      </w:r>
+      <w:r>
+        <w:t xml:space="preserve"> provide a means of establishing a Mesh service with minimal DNS configuration. An MSP supporting only Account Service Addresses need only perform a one-time configuration for the DNS entries of the Mesh service itself.</w:t>
+      </w:r>
+    </w:p>
+    <w:p>
+      <w:r>
+        <w:t xml:space="preserve">The disadvantage of using </w:t>
+      </w:r>
+      <w:r>
+        <w:t>Account Service Addresses</w:t>
+      </w:r>
+      <w:r>
+        <w:t xml:space="preserve"> is that it is tied to the MSP servicing the account. If a user changes their MSP, their </w:t>
+      </w:r>
+      <w:r>
+        <w:t>Account Service Address</w:t>
+      </w:r>
+      <w:r>
+        <w:t xml:space="preserve"> will change as well and </w:t>
+      </w:r>
+      <w:r>
+        <w:t xml:space="preserve">other users she has shared contact information with will be unable to contact her until they have updated their contact </w:t>
+      </w:r>
+      <w:proofErr w:type="gramStart"/>
+      <w:r>
+        <w:t>information</w:t>
+      </w:r>
+      <w:proofErr w:type="gramEnd"/>
+      <w:r>
+        <w:t xml:space="preserve"> so they know the address of the new service.</w:t>
+      </w:r>
+    </w:p>
+    <w:p>
+      <w:r>
+        <w:t xml:space="preserve">DNS handles are a DNS name registered by the user. This may be </w:t>
+      </w:r>
+      <w:proofErr w:type="gramStart"/>
+      <w:r>
+        <w:t>a direct</w:t>
+      </w:r>
+      <w:proofErr w:type="gramEnd"/>
+      <w:r>
+        <w:t xml:space="preserve"> registration by the user themselves or</w:t>
+      </w:r>
+      <w:r>
+        <w:t xml:space="preserve"> registered with a handle service provider (HSP) that provides subdomains under a domain registered to the HSP.</w:t>
+      </w:r>
+    </w:p>
+    <w:p>
+      <w:r>
+        <w:t xml:space="preserve">For example, Alice might register with the HSP example.com and be issued the handle @alice.example.com. </w:t>
+      </w:r>
+      <w:r>
+        <w:t xml:space="preserve">Passing her Mesh </w:t>
+      </w:r>
+      <w:r>
+        <w:t>Account Service Address</w:t>
+      </w:r>
+      <w:r>
+        <w:t xml:space="preserve"> information to </w:t>
+      </w:r>
+      <w:proofErr w:type="gramStart"/>
+      <w:r>
+        <w:t>the HSP</w:t>
+      </w:r>
+      <w:proofErr w:type="gramEnd"/>
+      <w:r>
+        <w:t xml:space="preserve"> would allow the HSP to bind it to Alice's Mesh account allowing use as an account identifier. Alternatively, Alice could register the DNS name </w:t>
+      </w:r>
+      <w:proofErr w:type="spellStart"/>
+      <w:r>
+        <w:t>therealalice.example</w:t>
+      </w:r>
+      <w:proofErr w:type="spellEnd"/>
+      <w:r>
+        <w:t xml:space="preserve"> with a DNS registrar which would publish the DNS records to bind @</w:t>
+      </w:r>
+      <w:r>
+        <w:t>therealalice.example</w:t>
+      </w:r>
+      <w:r>
+        <w:t xml:space="preserve"> to her </w:t>
+      </w:r>
+      <w:r>
+        <w:t>Mesh account</w:t>
+      </w:r>
+      <w:r>
+        <w:t xml:space="preserve">. Alice could also do both. </w:t>
+      </w:r>
+    </w:p>
+    <w:p>
+      <w:r>
+        <w:t>Handles issued by a HSP provided the exact same functionality as those registered through a DNS registrar. The only difference being that having her own DNS name makes Alice independent of the HSP and cannot be mistaken for an employee of the HSP.</w:t>
+      </w:r>
+    </w:p>
+    <w:p>
+      <w:r>
+        <w:t xml:space="preserve">While the roles of the HSP and MSP and the DNS registrar are separate, it is likely that a commercial service provider would offer all three as part of a seamless integrated service so that Alice could create her Mesh account and register a DNS handle in a single operation. Such a service provider is called a </w:t>
+      </w:r>
+      <w:proofErr w:type="gramStart"/>
+      <w:r>
+        <w:t>Full Service</w:t>
+      </w:r>
+      <w:proofErr w:type="gramEnd"/>
+      <w:r>
+        <w:t xml:space="preserve"> Mesh Service Provider.</w:t>
+      </w:r>
+    </w:p>
+    <w:p>
+      <w:r>
+        <w:t>Just as a DNS name (</w:t>
+      </w:r>
+      <w:r>
+        <w:rPr>
+          <w:u w:val="single"/>
+        </w:rPr>
+        <w:t>example.com</w:t>
+      </w:r>
+      <w:r>
+        <w:t>) provides a human friendly alias for an IP address (</w:t>
+      </w:r>
+      <w:r>
+        <w:rPr>
+          <w:u w:val="single"/>
+        </w:rPr>
+        <w:t>10.0.0.1</w:t>
+      </w:r>
+      <w:r>
+        <w:t xml:space="preserve">), DNS handles and </w:t>
+      </w:r>
+      <w:r>
+        <w:t>Account Service Address</w:t>
+      </w:r>
+      <w:r>
+        <w:t xml:space="preserve">es are both </w:t>
+      </w:r>
+      <w:r>
+        <w:t xml:space="preserve">human friendly </w:t>
+      </w:r>
+      <w:r>
+        <w:t xml:space="preserve">aliases for the </w:t>
+      </w:r>
+      <w:r>
+        <w:t xml:space="preserve">Direct Service Address </w:t>
+      </w:r>
+      <w:r>
+        <w:t>which provides a permanent identifier for the account and the address of the current service provider.</w:t>
+      </w:r>
+    </w:p>
+    <w:p>
+      <w:r>
+        <w:t xml:space="preserve">When Alice and Bob exchange contact information, the DNS Handle or </w:t>
+      </w:r>
+      <w:r>
+        <w:t>Account Service Addres</w:t>
+      </w:r>
+      <w:r>
+        <w:t xml:space="preserve">s is resolved to obtain the Direct Service Address that is used to establish and authenticate the contact exchange. Once the exchange is complete, </w:t>
+      </w:r>
+      <w:r>
+        <w:t>Alice's</w:t>
+      </w:r>
+      <w:r>
+        <w:t xml:space="preserve"> Mesh client will only use </w:t>
+      </w:r>
+      <w:proofErr w:type="gramStart"/>
+      <w:r>
+        <w:t xml:space="preserve">the </w:t>
+      </w:r>
+      <w:r>
+        <w:t>DNS</w:t>
+      </w:r>
+      <w:proofErr w:type="gramEnd"/>
+      <w:r>
+        <w:t xml:space="preserve"> Handle </w:t>
+      </w:r>
+      <w:r>
+        <w:t xml:space="preserve">to locate Alice's current service provider and use that to update the </w:t>
+      </w:r>
+      <w:r>
+        <w:t>Direct Service Address</w:t>
+      </w:r>
+      <w:r>
+        <w:t xml:space="preserve"> if required.</w:t>
+      </w:r>
+    </w:p>
+    <w:p>
+      <w:r>
+        <w:t xml:space="preserve">Thus, once Alice and Bob have exchanged contact information, they will continue to be able to communicate with each other using their DNS handles even if one of them changes service provider. They can even continue to communicate if both use the same service </w:t>
+      </w:r>
+      <w:proofErr w:type="gramStart"/>
+      <w:r>
+        <w:t>provider</w:t>
+      </w:r>
+      <w:proofErr w:type="gramEnd"/>
+      <w:r>
+        <w:t xml:space="preserve"> and it shuts down suddenly without notice. All they need to do is find a new service provider and update their handles.</w:t>
+      </w:r>
+    </w:p>
+    <w:p>
+      <w:pPr>
+        <w:pStyle w:val="Heading2"/>
+      </w:pPr>
+      <w:r>
         <w:t xml:space="preserve">Creating a Mesh </w:t>
       </w:r>
       <w:r>
@@ -2599,10 +2967,7 @@
         <w:pStyle w:val="DD"/>
       </w:pPr>
       <w:r>
-        <w:t xml:space="preserve">An alternative signature algorithm offering a work factor of </w:t>
-      </w:r>
-      <w:r>
-        <w:t>2</w:t>
+        <w:t>An alternative signature algorithm offering a work factor of 2</w:t>
       </w:r>
       <w:r>
         <w:rPr>
@@ -2611,10 +2976,7 @@
         <w:t>128</w:t>
       </w:r>
       <w:r>
-        <w:t xml:space="preserve"> against conventional cryptanalytic attack</w:t>
-      </w:r>
-      <w:r>
-        <w:t>s with slightly lower overheads than Ed448 which may prove useful for IoT applications.</w:t>
+        <w:t xml:space="preserve"> against conventional cryptanalytic attacks with slightly lower overheads than Ed448 which may prove useful for IoT applications.</w:t>
       </w:r>
     </w:p>
     <w:p>
@@ -2639,22 +3001,13 @@
         <w:t xml:space="preserve"> work factor against conventional cryptanalytic attacks </w:t>
       </w:r>
       <w:r>
-        <w:t>(</w:t>
-      </w:r>
-      <w:r>
-        <w:t>2</w:t>
+        <w:t>(2</w:t>
       </w:r>
       <w:r>
         <w:rPr>
           <w:vertAlign w:val="superscript"/>
         </w:rPr>
-        <w:t>2</w:t>
-      </w:r>
-      <w:r>
-        <w:rPr>
-          <w:vertAlign w:val="superscript"/>
-        </w:rPr>
-        <w:t>60</w:t>
+        <w:t>260</w:t>
       </w:r>
       <w:r>
         <w:t>) currently supported by any standards based conventional algorithm.</w:t>
@@ -3814,205 +4167,530 @@
         <w:pStyle w:val="Heading3"/>
       </w:pPr>
       <w:r>
-        <w:t>Service Transition</w:t>
-      </w:r>
-    </w:p>
-    <w:p>
-      <w:r>
-        <w:t xml:space="preserve">Allowing users to transfer their accounts from one service provider to another without switching costs is an important goal of the Mesh project. Enabling such transfers is the principal purpose of the Callsign registry </w:t>
-      </w:r>
-      <w:r>
-        <w:t>&lt;norm="draft-hallambaker-mesh-callsign"/&gt;.</w:t>
-      </w:r>
-    </w:p>
-    <w:p>
-      <w:r>
-        <w:t>Support for account transition is currently limited</w:t>
-      </w:r>
-      <w:r>
-        <w:t xml:space="preserve"> and untested. In theory a user MAY transfer their account from one service provider to another by opening an account at the new service provider and uploading the data</w:t>
-      </w:r>
-      <w:r>
-        <w:t xml:space="preserve"> provided that they have access to the profile primary secret and all threshold key shares granted to the devices are regenerated.</w:t>
-      </w:r>
-    </w:p>
-    <w:p>
-      <w:r>
-        <w:t xml:space="preserve">A different application of threshold cryptography and in particular the use of threshold techniques to generate key shares would allow a user to transfer their account without the need to reconstitute the </w:t>
-      </w:r>
-      <w:r>
-        <w:t>primary secret</w:t>
+        <w:t xml:space="preserve">Threshold </w:t>
+      </w:r>
+      <w:r>
+        <w:t>User Account</w:t>
+      </w:r>
+    </w:p>
+    <w:p>
+      <w:r>
+        <w:t>At present the administration device has direct access to the administrator key and it is not possible to determine which device performed a particular administration action.</w:t>
+      </w:r>
+      <w:r>
+        <w:t xml:space="preserve"> Similarly, the administration device requires access to the full decryption keys to create threshold key shares for devices.</w:t>
+      </w:r>
+    </w:p>
+    <w:p>
+      <w:r>
+        <w:t>As with the service transition issue described earlier, meeting this particular requirement using threshold cryptography is straightforward in itself. The challenge lies in meeting the requirements simultaneously. Or to be more precise, the challenge lies in understanding what the precise requirements are.</w:t>
+      </w:r>
+    </w:p>
+    <w:p>
+      <w:r>
+        <w:t>A sketch has been developed of an approach addressing both sets of requirements as currently understood. Instead of using an additive key splitting approach for creating key shares, the additive approach is combined with a Shamir/Lagrange approach</w:t>
+      </w:r>
+      <w:r>
+        <w:t xml:space="preserve"> such that:</w:t>
+      </w:r>
+    </w:p>
+    <w:p>
+      <w:pPr>
+        <w:pStyle w:val="li"/>
+      </w:pPr>
+      <w:r>
+        <w:t>A single administration device can connect devices using key shares mediated by the current service.</w:t>
+      </w:r>
+    </w:p>
+    <w:p>
+      <w:pPr>
+        <w:pStyle w:val="li"/>
+      </w:pPr>
+      <w:r>
+        <w:t>Two administration devices can create the necessary signatures and key shares to transfer the account to a different service provider.</w:t>
+      </w:r>
+    </w:p>
+    <w:p>
+      <w:pPr>
+        <w:pStyle w:val="li"/>
+      </w:pPr>
+      <w:r>
+        <w:t>Two administration devices can add a third administration device with the same capabilities as the original two.</w:t>
+      </w:r>
+    </w:p>
+    <w:p>
+      <w:r>
+        <w:t xml:space="preserve">Achieving the last requirement makes use of the fact that Lagrange interpolation can be used to generate additional shares without reconstructing the original secret. The x coordinate of each </w:t>
+      </w:r>
+      <w:proofErr w:type="spellStart"/>
+      <w:r>
+        <w:t>share holder</w:t>
+      </w:r>
+      <w:proofErr w:type="spellEnd"/>
+      <w:r>
+        <w:t xml:space="preserve"> is determined from the fingerprint of the device profile signature key.</w:t>
+      </w:r>
+    </w:p>
+    <w:p>
+      <w:pPr>
+        <w:pStyle w:val="Heading3"/>
+      </w:pPr>
+      <w:r>
+        <w:t>Threshold Group Administration</w:t>
+      </w:r>
+    </w:p>
+    <w:p>
+      <w:r>
+        <w:t>The current group encryption architecture requires that the group administrator have access to the decryption key. The administrator is thus able to decrypt any documents they chose and bypass the accounting restrictions of the service.</w:t>
+      </w:r>
+    </w:p>
+    <w:p>
+      <w:r>
+        <w:t xml:space="preserve">Further application of threshold techniques would allow the administrator role to be split between two or more parties, one of which might be a service enforcing additional controls. </w:t>
+      </w:r>
+    </w:p>
+    <w:p>
+      <w:pPr>
+        <w:pStyle w:val="Heading3"/>
+      </w:pPr>
+      <w:r>
+        <w:t>Social Media</w:t>
+      </w:r>
+    </w:p>
+    <w:p>
+      <w:r>
+        <w:t xml:space="preserve">One of the chief distinctions between </w:t>
+      </w:r>
+      <w:r>
+        <w:t xml:space="preserve">messaging </w:t>
+      </w:r>
+      <w:r>
+        <w:t xml:space="preserve">and 'social </w:t>
+      </w:r>
+      <w:proofErr w:type="gramStart"/>
+      <w:r>
+        <w:t>media' and</w:t>
+      </w:r>
+      <w:proofErr w:type="gramEnd"/>
+      <w:r>
+        <w:t xml:space="preserve"> is that the former is typically used to describe a synchronous interaction between a closed group of users while most social media </w:t>
+      </w:r>
+      <w:proofErr w:type="gramStart"/>
+      <w:r>
+        <w:t>consists</w:t>
+      </w:r>
+      <w:proofErr w:type="gramEnd"/>
+      <w:r>
+        <w:t xml:space="preserve"> of asynchronous interactions which are frequently (but not always) public.</w:t>
+      </w:r>
+    </w:p>
+    <w:p>
+      <w:r>
+        <w:t xml:space="preserve">The Data At Rest Envelope technology used in the Mesh was originally designed to support </w:t>
+      </w:r>
+      <w:r>
+        <w:t xml:space="preserve">asynchronous social media interactions with full end-to-end confidentiality. The service hosting a forum </w:t>
+      </w:r>
+      <w:proofErr w:type="spellStart"/>
+      <w:r>
+        <w:t>or</w:t>
+      </w:r>
+      <w:proofErr w:type="spellEnd"/>
+      <w:r>
+        <w:t xml:space="preserve"> discussion board need not have access to the content of the messages to support the complete range of user interactions.</w:t>
+      </w:r>
+    </w:p>
+    <w:p>
+      <w:pPr>
+        <w:pStyle w:val="Heading1"/>
+      </w:pPr>
+      <w:r>
+        <w:t>Naming</w:t>
+      </w:r>
+    </w:p>
+    <w:p>
+      <w:r>
+        <w:t>Each Mesh account has a</w:t>
+      </w:r>
+      <w:r>
+        <w:t xml:space="preserve">n account </w:t>
+      </w:r>
+      <w:r>
+        <w:t xml:space="preserve">profile </w:t>
+      </w:r>
+      <w:r>
+        <w:t>with a unique profile fingerprint that may be used to verify the account profile and assertions signed under that profile. The profile fingerprint is the UDF fingerprint of the list of signature key fingerprints specified in the profile.</w:t>
+      </w:r>
+      <w:r>
+        <w:t xml:space="preserve"> For example, </w:t>
+      </w:r>
+      <w:r>
+        <w:rPr>
+          <w:u w:val="single"/>
+        </w:rPr>
+        <w:t>maua-f6qe-ejui-gbwr-c4bh-4x5o-tlah</w:t>
       </w:r>
       <w:r>
         <w:t>.</w:t>
       </w:r>
     </w:p>
     <w:p>
-      <w:pPr>
-        <w:pStyle w:val="Heading3"/>
-      </w:pPr>
-      <w:r>
-        <w:t xml:space="preserve">Threshold </w:t>
-      </w:r>
-      <w:r>
-        <w:t>User Account</w:t>
-      </w:r>
-    </w:p>
-    <w:p>
-      <w:r>
-        <w:t>At present the administration device has direct access to the administrator key and it is not possible to determine which device performed a particular administration action.</w:t>
-      </w:r>
-      <w:r>
-        <w:t xml:space="preserve"> Similarly, the administration device requires access to the full decryption keys to create threshold key shares for devices.</w:t>
-      </w:r>
-    </w:p>
-    <w:p>
-      <w:r>
-        <w:t>As with the service transition issue described earlier, meeting this particular requirement using threshold cryptography is straightforward in itself. The challenge lies in meeting the requirements simultaneously. Or to be more precise, the challenge lies in understanding what the precise requirements are.</w:t>
-      </w:r>
-    </w:p>
-    <w:p>
-      <w:r>
-        <w:t>A sketch has been developed of an approach addressing both sets of requirements as currently understood. Instead of using an additive key splitting approach for creating key shares, the additive approach is combined with a Shamir/Lagrange approach</w:t>
-      </w:r>
-      <w:r>
-        <w:t xml:space="preserve"> such that:</w:t>
-      </w:r>
-    </w:p>
-    <w:p>
-      <w:pPr>
-        <w:pStyle w:val="li"/>
-      </w:pPr>
-      <w:r>
-        <w:t>A single administration device can connect devices using key shares mediated by the current service.</w:t>
-      </w:r>
-    </w:p>
-    <w:p>
-      <w:pPr>
-        <w:pStyle w:val="li"/>
-      </w:pPr>
-      <w:r>
-        <w:t>Two administration devices can create the necessary signatures and key shares to transfer the account to a different service provider.</w:t>
-      </w:r>
-    </w:p>
-    <w:p>
-      <w:pPr>
-        <w:pStyle w:val="li"/>
-      </w:pPr>
-      <w:r>
-        <w:t>Two administration devices can add a third administration device with the same capabilities as the original two.</w:t>
-      </w:r>
-    </w:p>
-    <w:p>
-      <w:r>
-        <w:t xml:space="preserve">Achieving the last requirement makes use of the fact that Lagrange interpolation can be used to generate additional shares without reconstructing the original secret. The x coordinate of each </w:t>
+      <w:r>
+        <w:t xml:space="preserve">To interact with the Mesh account a device or service needs to know the account's </w:t>
+      </w:r>
+      <w:r>
+        <w:t>profile fingerprint</w:t>
+      </w:r>
+      <w:r>
+        <w:t xml:space="preserve"> and the DNS address of the current service provider.</w:t>
+      </w:r>
+      <w:r>
+        <w:t xml:space="preserve"> For example, </w:t>
+      </w:r>
+      <w:r>
+        <w:rPr>
+          <w:u w:val="single"/>
+        </w:rPr>
+        <w:t>example.com</w:t>
+      </w:r>
+      <w:r>
+        <w:t>.</w:t>
+      </w:r>
+    </w:p>
+    <w:p>
+      <w:r>
+        <w:t xml:space="preserve">These addresses MAY be combined into a single identifier </w:t>
+      </w:r>
+      <w:proofErr w:type="gramStart"/>
+      <w:r>
+        <w:t>to form</w:t>
+      </w:r>
+      <w:proofErr w:type="gramEnd"/>
+      <w:r>
+        <w:t xml:space="preserve"> the Direct Service Address.</w:t>
+      </w:r>
+      <w:r>
+        <w:t xml:space="preserve"> </w:t>
+      </w:r>
+      <w:r>
+        <w:t>This is the form of address that is used in contact assertions and configuring DNS Handles.</w:t>
+      </w:r>
+      <w:r>
+        <w:t xml:space="preserve"> </w:t>
+      </w:r>
+      <w:r>
+        <w:t xml:space="preserve">For example, </w:t>
+      </w:r>
+      <w:r>
+        <w:rPr>
+          <w:u w:val="single"/>
+        </w:rPr>
+        <w:t>@m</w:t>
+      </w:r>
+      <w:r>
+        <w:rPr>
+          <w:u w:val="single"/>
+        </w:rPr>
+        <w:t>aua-f6qe-ejui-gbwr-c4bh-4x5o-tlah@example.com</w:t>
+      </w:r>
+      <w:r>
+        <w:t>.</w:t>
+      </w:r>
+    </w:p>
+    <w:p>
+      <w:r>
+        <w:t>Names with long strings of Base32 encoded data are inconvenient for human users</w:t>
+      </w:r>
+      <w:r>
+        <w:t>. As previously described in the user experience section, the preferred means of identifying an account is using a DNS handle bound to that account by means of a DNS TXT record entry as described in &lt;norm="</w:t>
+      </w:r>
+      <w:r>
+        <w:t>draft-hallambaker-any</w:t>
+      </w:r>
+      <w:r>
+        <w:t>"</w:t>
+      </w:r>
+      <w:proofErr w:type="gramStart"/>
+      <w:r>
+        <w:t>&gt;.For</w:t>
+      </w:r>
+      <w:proofErr w:type="gramEnd"/>
+      <w:r>
+        <w:t xml:space="preserve"> example, </w:t>
+      </w:r>
+      <w:r>
+        <w:rPr>
+          <w:u w:val="single"/>
+        </w:rPr>
+        <w:t>@alice.example.com</w:t>
+      </w:r>
+      <w:r>
+        <w:t xml:space="preserve"> and </w:t>
+      </w:r>
+      <w:r>
+        <w:rPr>
+          <w:u w:val="single"/>
+        </w:rPr>
+        <w:t>@threalalice.example</w:t>
+      </w:r>
+      <w:r>
+        <w:t>.</w:t>
+      </w:r>
+    </w:p>
+    <w:p>
+      <w:r>
+        <w:t xml:space="preserve">DNS Handles are the preferred identifier form but require configuration of a DNS service. Account Service Addresses consisting of an account name and DNS address of the service provider provide a user-friendly means of referring to the account without the need for an additional layer of configuration. For example, Alice registers the name </w:t>
+      </w:r>
+      <w:r>
+        <w:rPr>
+          <w:u w:val="single"/>
+        </w:rPr>
+        <w:t>alice@example.com</w:t>
+      </w:r>
+      <w:r>
+        <w:t>.</w:t>
+      </w:r>
+    </w:p>
+    <w:p>
+      <w:r>
+        <w:t xml:space="preserve">The user-friendly name forms provide convenience but do not provide a direct trust path. Combining the profile fingerprint with either </w:t>
       </w:r>
       <w:proofErr w:type="spellStart"/>
-      <w:r>
-        <w:t>share holder</w:t>
+      <w:proofErr w:type="gramStart"/>
+      <w:r>
+        <w:t>a</w:t>
       </w:r>
       <w:proofErr w:type="spellEnd"/>
-      <w:r>
-        <w:t xml:space="preserve"> is determined from the fingerprint of the device profile signature key.</w:t>
-      </w:r>
-    </w:p>
-    <w:p>
-      <w:pPr>
-        <w:pStyle w:val="Heading3"/>
-      </w:pPr>
-      <w:r>
-        <w:t>Threshold Group Administration</w:t>
-      </w:r>
-    </w:p>
-    <w:p>
-      <w:r>
-        <w:t>The current group encryption architecture requires that the group administrator have access to the decryption key. The administrator is thus able to decrypt any documents they chose and bypass the accounting restrictions of the service.</w:t>
-      </w:r>
-    </w:p>
-    <w:p>
-      <w:r>
-        <w:t xml:space="preserve">Further application of threshold techniques would allow the administrator role to be split between two or more parties, one of which might be a service enforcing additional controls. </w:t>
-      </w:r>
-    </w:p>
-    <w:p>
-      <w:pPr>
-        <w:pStyle w:val="Heading3"/>
-      </w:pPr>
-      <w:r>
-        <w:t xml:space="preserve">Synchronous </w:t>
-      </w:r>
-      <w:r>
-        <w:t>M</w:t>
-      </w:r>
-      <w:r>
-        <w:t>essaging</w:t>
-      </w:r>
-    </w:p>
-    <w:p>
-      <w:r>
-        <w:t xml:space="preserve">Addition of a presence service capability to the MSP would allow Mesh Messaging to be used to support the full range of synchronous messaging services from text chat (e.g. </w:t>
-      </w:r>
-      <w:proofErr w:type="spellStart"/>
-      <w:r>
-        <w:t>xmpp</w:t>
-      </w:r>
-      <w:proofErr w:type="spellEnd"/>
-      <w:r>
-        <w:t>) to video and VOIP.</w:t>
-      </w:r>
-      <w:r>
-        <w:t xml:space="preserve"> The chief security benefit to the end user for such a scheme would be that every communication request is mediated by access control. While it is impossible to absolutely guarantee that every possible form of abuse is prevented, stopping the organized crime ring that just called me purporting to be my credit card company is much more straightforward.</w:t>
-      </w:r>
-    </w:p>
-    <w:p>
-      <w:r>
-        <w:t xml:space="preserve">The main </w:t>
-      </w:r>
-      <w:r>
-        <w:t>technical issue to be addressed to enable such a service is specifying a means of layering Mesh Messages direct over UDP transport. This is currently at the concept phase. While the precise means of layering audio and video formats onto a network connection is a complex problem, it is one that has already been solved by existing standards.</w:t>
-      </w:r>
-    </w:p>
-    <w:p>
-      <w:pPr>
-        <w:pStyle w:val="Heading3"/>
-      </w:pPr>
-      <w:r>
-        <w:t>Social Media</w:t>
-      </w:r>
-    </w:p>
-    <w:p>
-      <w:r>
-        <w:t xml:space="preserve">One of the chief distinctions between </w:t>
-      </w:r>
-      <w:r>
-        <w:t xml:space="preserve">messaging </w:t>
-      </w:r>
-      <w:r>
-        <w:t xml:space="preserve">and 'social media' and is that the former is typically used to describe a synchronous interaction between a closed group of users while most social media </w:t>
+      <w:proofErr w:type="gramEnd"/>
+      <w:r>
+        <w:t xml:space="preserve"> Account Service Address or the DNS Handle provides an identifier that is both immutable and human readable.</w:t>
+      </w:r>
+    </w:p>
+    <w:p>
+      <w:r>
+        <w:t xml:space="preserve">Finally, </w:t>
       </w:r>
       <w:proofErr w:type="gramStart"/>
       <w:r>
-        <w:t>consists</w:t>
+        <w:t>the Mesh</w:t>
       </w:r>
       <w:proofErr w:type="gramEnd"/>
       <w:r>
-        <w:t xml:space="preserve"> of asynchronous interactions which are frequently (but not always) public.</w:t>
-      </w:r>
-    </w:p>
-    <w:p>
-      <w:r>
-        <w:t xml:space="preserve">The Data At Rest Envelope technology used in the Mesh was originally designed to support </w:t>
-      </w:r>
-      <w:r>
-        <w:t xml:space="preserve">asynchronous social media interactions with full end-to-end confidentiality. The service hosting a forum </w:t>
-      </w:r>
-      <w:proofErr w:type="spellStart"/>
-      <w:r>
-        <w:t>or</w:t>
-      </w:r>
-      <w:proofErr w:type="spellEnd"/>
-      <w:r>
-        <w:t xml:space="preserve"> discussion board need not have access to the content of the messages to support the complete range of user interactions.</w:t>
+        <w:t xml:space="preserve"> allows users to define local names for the devices and applications under their control and for other users. For example, after exchanging contact information with Alice, Bob might assign the local name @alice to her account to save typing and Carol might assign the local name @</w:t>
+      </w:r>
+      <w:r>
+        <w:t>wife</w:t>
+      </w:r>
+      <w:r>
+        <w:t xml:space="preserve"> so that she can refer to Alice by </w:t>
+      </w:r>
+      <w:r>
+        <w:t>their</w:t>
+      </w:r>
+      <w:r>
+        <w:t xml:space="preserve"> </w:t>
+      </w:r>
+      <w:r>
+        <w:t>relationship</w:t>
+      </w:r>
+      <w:r>
+        <w:t>.</w:t>
+      </w:r>
+    </w:p>
+    <w:p>
+      <w:r>
+        <w:t>There are thus, the following identifier forms used for different purposes in the Mesh:</w:t>
+      </w:r>
+    </w:p>
+    <w:p>
+      <w:pPr>
+        <w:pStyle w:val="DT"/>
+      </w:pPr>
+      <w:r>
+        <w:t xml:space="preserve">Profile Fingerprint (e.g. </w:t>
+      </w:r>
+      <w:r>
+        <w:rPr>
+          <w:u w:val="single"/>
+        </w:rPr>
+        <w:t>maua-f6qe-ejui-gbwr-c4bh-4x5o-tlah</w:t>
+      </w:r>
+      <w:r>
+        <w:t>)</w:t>
+      </w:r>
+    </w:p>
+    <w:p>
+      <w:pPr>
+        <w:pStyle w:val="DD"/>
+      </w:pPr>
+      <w:r>
+        <w:t>A cryptographic digest of the list of public digital signature keys that form the root of trust for the account. The profile fingerprint uniquely identifies the account but not the address of the current service provider.</w:t>
+      </w:r>
+    </w:p>
+    <w:p>
+      <w:pPr>
+        <w:pStyle w:val="DT"/>
+      </w:pPr>
+      <w:r>
+        <w:t xml:space="preserve">Direct Service Address (e.g. </w:t>
+      </w:r>
+      <w:r>
+        <w:rPr>
+          <w:u w:val="single"/>
+        </w:rPr>
+        <w:t>@m</w:t>
+      </w:r>
+      <w:r>
+        <w:rPr>
+          <w:u w:val="single"/>
+        </w:rPr>
+        <w:t>aua-f6qe-ejui-gbwr-c4bh-4x5o-tlah@example.com</w:t>
+      </w:r>
+      <w:r>
+        <w:t>)</w:t>
+      </w:r>
+    </w:p>
+    <w:p>
+      <w:pPr>
+        <w:pStyle w:val="DD"/>
+      </w:pPr>
+      <w:r>
+        <w:t>The profile fingerprint combined with the DNS address of the service provider.</w:t>
+      </w:r>
+    </w:p>
+    <w:p>
+      <w:pPr>
+        <w:pStyle w:val="DT"/>
+      </w:pPr>
+      <w:r>
+        <w:t xml:space="preserve">Account Service Address (e.g. </w:t>
+      </w:r>
+      <w:r>
+        <w:rPr>
+          <w:u w:val="single"/>
+        </w:rPr>
+        <w:t>alice@example.com</w:t>
+      </w:r>
+      <w:r>
+        <w:t>)</w:t>
+      </w:r>
+    </w:p>
+    <w:p>
+      <w:pPr>
+        <w:pStyle w:val="DD"/>
+      </w:pPr>
+      <w:r>
+        <w:t>A name selected by the user or the service provider combined with the DNS address of the service provider.</w:t>
+      </w:r>
+    </w:p>
+    <w:p>
+      <w:pPr>
+        <w:pStyle w:val="DT"/>
+      </w:pPr>
+      <w:r>
+        <w:t xml:space="preserve">Direct Account Service Address (e.g. </w:t>
+      </w:r>
+      <w:hyperlink r:id="rId6" w:history="1">
+        <w:r>
+          <w:rPr>
+            <w:rStyle w:val="Hyperlink"/>
+          </w:rPr>
+          <w:t>maua-f6qe-ejui-gbwr-c4bh-4x5o-tlah@alice@example.com</w:t>
+        </w:r>
+      </w:hyperlink>
+      <w:r>
+        <w:t>)</w:t>
+      </w:r>
+    </w:p>
+    <w:p>
+      <w:pPr>
+        <w:pStyle w:val="DD"/>
+      </w:pPr>
+      <w:r>
+        <w:t>The profile fingerprint combined with the Direct Service Address</w:t>
+      </w:r>
+    </w:p>
+    <w:p>
+      <w:pPr>
+        <w:pStyle w:val="DT"/>
+      </w:pPr>
+      <w:r>
+        <w:t>DNS Handle (e.</w:t>
+      </w:r>
+      <w:proofErr w:type="gramStart"/>
+      <w:r>
+        <w:t>g. @alice.example.net</w:t>
+      </w:r>
+      <w:proofErr w:type="gramEnd"/>
+      <w:r>
+        <w:t>)</w:t>
+      </w:r>
+    </w:p>
+    <w:p>
+      <w:pPr>
+        <w:pStyle w:val="DD"/>
+      </w:pPr>
+      <w:r>
+        <w:t>A DNS handle registered by the user that is bound to the Direct Service Address of the account by means of a DNS TXT record entry.</w:t>
+      </w:r>
+    </w:p>
+    <w:p>
+      <w:pPr>
+        <w:pStyle w:val="DT"/>
+      </w:pPr>
+      <w:r>
+        <w:t xml:space="preserve">Direct DNS Handle (e.g. </w:t>
+      </w:r>
+      <w:r>
+        <w:rPr>
+          <w:u w:val="single"/>
+        </w:rPr>
+        <w:t>maua-f6qe-ejui-gbwr-c4bh-4x5o-tlah@</w:t>
+      </w:r>
+      <w:r>
+        <w:rPr>
+          <w:u w:val="single"/>
+        </w:rPr>
+        <w:t>@alice.</w:t>
+      </w:r>
+      <w:r>
+        <w:rPr>
+          <w:u w:val="single"/>
+        </w:rPr>
+        <w:t>example.</w:t>
+      </w:r>
+      <w:r>
+        <w:rPr>
+          <w:u w:val="single"/>
+        </w:rPr>
+        <w:t>net</w:t>
+      </w:r>
+      <w:r>
+        <w:t>)</w:t>
+      </w:r>
+    </w:p>
+    <w:p>
+      <w:pPr>
+        <w:pStyle w:val="DD"/>
+      </w:pPr>
+      <w:r>
+        <w:t>The profile fingerprint combined with a DNS Handle</w:t>
+      </w:r>
+    </w:p>
+    <w:p>
+      <w:pPr>
+        <w:pStyle w:val="DT"/>
+      </w:pPr>
+      <w:r>
+        <w:t>Local name (e.g. @alice)</w:t>
+      </w:r>
+    </w:p>
+    <w:p>
+      <w:pPr>
+        <w:pStyle w:val="DD"/>
+      </w:pPr>
+      <w:r>
+        <w:t xml:space="preserve">A name assigned to a Mesh user or device for personal use with scope limited to the user who assigned it. </w:t>
       </w:r>
     </w:p>
     <w:p>
@@ -4396,8 +5074,13 @@
       <w:bookmarkEnd w:id="9"/>
     </w:p>
     <w:p>
-      <w:r>
-        <w:t xml:space="preserve">The mathematics that </w:t>
+      <w:proofErr w:type="gramStart"/>
+      <w:r>
+        <w:t>The mathematics</w:t>
+      </w:r>
+      <w:proofErr w:type="gramEnd"/>
+      <w:r>
+        <w:t xml:space="preserve"> that </w:t>
       </w:r>
       <w:proofErr w:type="gramStart"/>
       <w:r>
@@ -7613,7 +8296,7 @@
 </file>
 
 <file path=word/numbering.xml><?xml version="1.0" encoding="utf-8"?>
-<w:numbering xmlns:wpc="http://schemas.microsoft.com/office/word/2010/wordprocessingCanvas" xmlns:cx="http://schemas.microsoft.com/office/drawing/2014/chartex" xmlns:cx1="http://schemas.microsoft.com/office/drawing/2015/9/8/chartex" xmlns:cx2="http://schemas.microsoft.com/office/drawing/2015/10/21/chartex" xmlns:cx3="http://schemas.microsoft.com/office/drawing/2016/5/9/chartex" xmlns:cx4="http://schemas.microsoft.com/office/drawing/2016/5/10/chartex" xmlns:cx5="http://schemas.microsoft.com/office/drawing/2016/5/11/chartex" xmlns:cx6="http://schemas.microsoft.com/office/drawing/2016/5/12/chartex" xmlns:cx7="http://schemas.microsoft.com/office/drawing/2016/5/13/chartex" xmlns:cx8="http://schemas.microsoft.com/office/drawing/2016/5/14/chartex" xmlns:mc="http://schemas.openxmlformats.org/markup-compatibility/2006" xmlns:aink="http://schemas.microsoft.com/office/drawing/2016/ink" xmlns:am3d="http://schemas.microsoft.com/office/drawing/2017/model3d" xmlns:o="urn:schemas-microsoft-com:office:office" xmlns:oel="http://schemas.microsoft.com/office/2019/extlst" xmlns:r="http://schemas.openxmlformats.org/officeDocument/2006/relationships" xmlns:m="http://schemas.openxmlformats.org/officeDocument/2006/math" xmlns:v="urn:schemas-microsoft-com:vml" xmlns:wp14="http://schemas.microsoft.com/office/word/2010/wordprocessingDrawing" xmlns:wp="http://schemas.openxmlformats.org/drawingml/2006/wordprocessingDrawing" xmlns:w10="urn:schemas-microsoft-com:office:word" xmlns:w="http://schemas.openxmlformats.org/wordprocessingml/2006/main" xmlns:w14="http://schemas.microsoft.com/office/word/2010/wordml" xmlns:w15="http://schemas.microsoft.com/office/word/2012/wordml" xmlns:w16cex="http://schemas.microsoft.com/office/word/2018/wordml/cex" xmlns:w16cid="http://schemas.microsoft.com/office/word/2016/wordml/cid" xmlns:w16="http://schemas.microsoft.com/office/word/2018/wordml" xmlns:w16du="http://schemas.microsoft.com/office/word/2023/wordml/word16du" xmlns:w16sdtdh="http://schemas.microsoft.com/office/word/2020/wordml/sdtdatahash" xmlns:w16se="http://schemas.microsoft.com/office/word/2015/wordml/symex" xmlns:wpg="http://schemas.microsoft.com/office/word/2010/wordprocessingGroup" xmlns:wpi="http://schemas.microsoft.com/office/word/2010/wordprocessingInk" xmlns:wne="http://schemas.microsoft.com/office/word/2006/wordml" xmlns:wps="http://schemas.microsoft.com/office/word/2010/wordprocessingShape" mc:Ignorable="w14 w15 w16se w16cid w16 w16cex w16sdtdh w16du wp14">
+<w:numbering xmlns:wpc="http://schemas.microsoft.com/office/word/2010/wordprocessingCanvas" xmlns:cx="http://schemas.microsoft.com/office/drawing/2014/chartex" xmlns:cx1="http://schemas.microsoft.com/office/drawing/2015/9/8/chartex" xmlns:cx2="http://schemas.microsoft.com/office/drawing/2015/10/21/chartex" xmlns:cx3="http://schemas.microsoft.com/office/drawing/2016/5/9/chartex" xmlns:cx4="http://schemas.microsoft.com/office/drawing/2016/5/10/chartex" xmlns:cx5="http://schemas.microsoft.com/office/drawing/2016/5/11/chartex" xmlns:cx6="http://schemas.microsoft.com/office/drawing/2016/5/12/chartex" xmlns:cx7="http://schemas.microsoft.com/office/drawing/2016/5/13/chartex" xmlns:cx8="http://schemas.microsoft.com/office/drawing/2016/5/14/chartex" xmlns:mc="http://schemas.openxmlformats.org/markup-compatibility/2006" xmlns:aink="http://schemas.microsoft.com/office/drawing/2016/ink" xmlns:am3d="http://schemas.microsoft.com/office/drawing/2017/model3d" xmlns:o="urn:schemas-microsoft-com:office:office" xmlns:oel="http://schemas.microsoft.com/office/2019/extlst" xmlns:r="http://schemas.openxmlformats.org/officeDocument/2006/relationships" xmlns:m="http://schemas.openxmlformats.org/officeDocument/2006/math" xmlns:v="urn:schemas-microsoft-com:vml" xmlns:wp14="http://schemas.microsoft.com/office/word/2010/wordprocessingDrawing" xmlns:wp="http://schemas.openxmlformats.org/drawingml/2006/wordprocessingDrawing" xmlns:w10="urn:schemas-microsoft-com:office:word" xmlns:w="http://schemas.openxmlformats.org/wordprocessingml/2006/main" xmlns:w14="http://schemas.microsoft.com/office/word/2010/wordml" xmlns:w15="http://schemas.microsoft.com/office/word/2012/wordml" xmlns:w16cex="http://schemas.microsoft.com/office/word/2018/wordml/cex" xmlns:w16cid="http://schemas.microsoft.com/office/word/2016/wordml/cid" xmlns:w16="http://schemas.microsoft.com/office/word/2018/wordml" xmlns:w16du="http://schemas.microsoft.com/office/word/2023/wordml/word16du" xmlns:w16sdtdh="http://schemas.microsoft.com/office/word/2020/wordml/sdtdatahash" xmlns:w16sdtfl="http://schemas.microsoft.com/office/word/2024/wordml/sdtformatlock" xmlns:w16se="http://schemas.microsoft.com/office/word/2015/wordml/symex" xmlns:wpg="http://schemas.microsoft.com/office/word/2010/wordprocessingGroup" xmlns:wpi="http://schemas.microsoft.com/office/word/2010/wordprocessingInk" xmlns:wne="http://schemas.microsoft.com/office/word/2006/wordml" xmlns:wps="http://schemas.microsoft.com/office/word/2010/wordprocessingShape" mc:Ignorable="w14 w15 w16se w16cid w16 w16cex w16sdtdh w16sdtfl w16du wp14">
   <w:abstractNum w:abstractNumId="0" w15:restartNumberingAfterBreak="0">
     <w:nsid w:val="0CFB2AEE"/>
     <w:multiLevelType w:val="hybridMultilevel"/>
@@ -8517,7 +9200,7 @@
 </file>
 
 <file path=word/styles.xml><?xml version="1.0" encoding="utf-8"?>
-<w:styles xmlns:mc="http://schemas.openxmlformats.org/markup-compatibility/2006" xmlns:r="http://schemas.openxmlformats.org/officeDocument/2006/relationships" xmlns:w="http://schemas.openxmlformats.org/wordprocessingml/2006/main" xmlns:w14="http://schemas.microsoft.com/office/word/2010/wordml" xmlns:w15="http://schemas.microsoft.com/office/word/2012/wordml" xmlns:w16cex="http://schemas.microsoft.com/office/word/2018/wordml/cex" xmlns:w16cid="http://schemas.microsoft.com/office/word/2016/wordml/cid" xmlns:w16="http://schemas.microsoft.com/office/word/2018/wordml" xmlns:w16du="http://schemas.microsoft.com/office/word/2023/wordml/word16du" xmlns:w16sdtdh="http://schemas.microsoft.com/office/word/2020/wordml/sdtdatahash" xmlns:w16se="http://schemas.microsoft.com/office/word/2015/wordml/symex" mc:Ignorable="w14 w15 w16se w16cid w16 w16cex w16sdtdh w16du">
+<w:styles xmlns:mc="http://schemas.openxmlformats.org/markup-compatibility/2006" xmlns:r="http://schemas.openxmlformats.org/officeDocument/2006/relationships" xmlns:w="http://schemas.openxmlformats.org/wordprocessingml/2006/main" xmlns:w14="http://schemas.microsoft.com/office/word/2010/wordml" xmlns:w15="http://schemas.microsoft.com/office/word/2012/wordml" xmlns:w16cex="http://schemas.microsoft.com/office/word/2018/wordml/cex" xmlns:w16cid="http://schemas.microsoft.com/office/word/2016/wordml/cid" xmlns:w16="http://schemas.microsoft.com/office/word/2018/wordml" xmlns:w16du="http://schemas.microsoft.com/office/word/2023/wordml/word16du" xmlns:w16sdtdh="http://schemas.microsoft.com/office/word/2020/wordml/sdtdatahash" xmlns:w16sdtfl="http://schemas.microsoft.com/office/word/2024/wordml/sdtformatlock" xmlns:w16se="http://schemas.microsoft.com/office/word/2015/wordml/symex" mc:Ignorable="w14 w15 w16se w16cid w16 w16cex w16sdtdh w16sdtfl w16du">
   <w:docDefaults>
     <w:rPrDefault>
       <w:rPr>
@@ -9379,6 +10062,36 @@
       </w:tblBorders>
     </w:tblPr>
   </w:style>
+  <w:style w:type="paragraph" w:styleId="HTMLPreformatted">
+    <w:name w:val="HTML Preformatted"/>
+    <w:basedOn w:val="Normal"/>
+    <w:link w:val="HTMLPreformattedChar"/>
+    <w:uiPriority w:val="99"/>
+    <w:semiHidden/>
+    <w:unhideWhenUsed/>
+    <w:rsid w:val="004018A5"/>
+    <w:pPr>
+      <w:spacing w:after="0" w:line="240" w:lineRule="auto"/>
+    </w:pPr>
+    <w:rPr>
+      <w:rFonts w:ascii="Consolas" w:hAnsi="Consolas"/>
+      <w:sz w:val="20"/>
+      <w:szCs w:val="20"/>
+    </w:rPr>
+  </w:style>
+  <w:style w:type="character" w:customStyle="1" w:styleId="HTMLPreformattedChar">
+    <w:name w:val="HTML Preformatted Char"/>
+    <w:basedOn w:val="DefaultParagraphFont"/>
+    <w:link w:val="HTMLPreformatted"/>
+    <w:uiPriority w:val="99"/>
+    <w:semiHidden/>
+    <w:rsid w:val="004018A5"/>
+    <w:rPr>
+      <w:rFonts w:ascii="Consolas" w:hAnsi="Consolas"/>
+      <w:sz w:val="20"/>
+      <w:szCs w:val="20"/>
+    </w:rPr>
+  </w:style>
 </w:styles>
 </file>
 

</xml_diff>

<commit_message>
Construct test cases for DNS Handles, Mesh Contacts and Thing service
</commit_message>
<xml_diff>
--- a/Outputs/Documents/Word/hallambaker-mesh-1-architecture.docx
+++ b/Outputs/Documents/Word/hallambaker-mesh-1-architecture.docx
@@ -2545,27 +2545,12 @@
     </w:p>
     <w:p>
       <w:r>
-        <w:t>Account Service Addresses</w:t>
-      </w:r>
-      <w:r>
-        <w:t xml:space="preserve"> provide a means of establishing a Mesh service with minimal DNS configuration. An MSP supporting only Account Service Addresses need only perform a one-time configuration for the DNS entries of the Mesh service itself.</w:t>
-      </w:r>
-    </w:p>
-    <w:p>
-      <w:r>
-        <w:t xml:space="preserve">The disadvantage of using </w:t>
-      </w:r>
-      <w:r>
-        <w:t>Account Service Addresses</w:t>
-      </w:r>
-      <w:r>
-        <w:t xml:space="preserve"> is that it is tied to the MSP servicing the account. If a user changes their MSP, their </w:t>
-      </w:r>
-      <w:r>
-        <w:t>Account Service Address</w:t>
-      </w:r>
-      <w:r>
-        <w:t xml:space="preserve"> will change as well and </w:t>
+        <w:t>Account Service Addresses provide a means of establishing a Mesh service with minimal DNS configuration. An MSP supporting only Account Service Addresses need only perform a one-time configuration for the DNS entries of the Mesh service itself.</w:t>
+      </w:r>
+    </w:p>
+    <w:p>
+      <w:r>
+        <w:t xml:space="preserve">The disadvantage of using Account Service Addresses is that it is tied to the MSP servicing the account. If a user changes their MSP, their Account Service Address will change as well and </w:t>
       </w:r>
       <w:r>
         <w:t xml:space="preserve">other users she has shared contact information with will be unable to contact her until they have updated their contact </w:t>
@@ -2600,13 +2585,7 @@
         <w:t xml:space="preserve">For example, Alice might register with the HSP example.com and be issued the handle @alice.example.com. </w:t>
       </w:r>
       <w:r>
-        <w:t xml:space="preserve">Passing her Mesh </w:t>
-      </w:r>
-      <w:r>
-        <w:t>Account Service Address</w:t>
-      </w:r>
-      <w:r>
-        <w:t xml:space="preserve"> information to </w:t>
+        <w:t xml:space="preserve">Passing her Mesh Account Service Address information to </w:t>
       </w:r>
       <w:proofErr w:type="gramStart"/>
       <w:r>
@@ -2622,19 +2601,7 @@
       </w:r>
       <w:proofErr w:type="spellEnd"/>
       <w:r>
-        <w:t xml:space="preserve"> with a DNS registrar which would publish the DNS records to bind @</w:t>
-      </w:r>
-      <w:r>
-        <w:t>therealalice.example</w:t>
-      </w:r>
-      <w:r>
-        <w:t xml:space="preserve"> to her </w:t>
-      </w:r>
-      <w:r>
-        <w:t>Mesh account</w:t>
-      </w:r>
-      <w:r>
-        <w:t xml:space="preserve">. Alice could also do both. </w:t>
+        <w:t xml:space="preserve"> with a DNS registrar which would publish the DNS records to bind @therealalice.example to her Mesh account. Alice could also do both. </w:t>
       </w:r>
     </w:p>
     <w:p>
@@ -2675,36 +2642,12 @@
         <w:t>10.0.0.1</w:t>
       </w:r>
       <w:r>
-        <w:t xml:space="preserve">), DNS handles and </w:t>
-      </w:r>
-      <w:r>
-        <w:t>Account Service Address</w:t>
-      </w:r>
-      <w:r>
-        <w:t xml:space="preserve">es are both </w:t>
-      </w:r>
-      <w:r>
-        <w:t xml:space="preserve">human friendly </w:t>
-      </w:r>
-      <w:r>
-        <w:t xml:space="preserve">aliases for the </w:t>
-      </w:r>
-      <w:r>
-        <w:t xml:space="preserve">Direct Service Address </w:t>
-      </w:r>
-      <w:r>
-        <w:t>which provides a permanent identifier for the account and the address of the current service provider.</w:t>
-      </w:r>
-    </w:p>
-    <w:p>
-      <w:r>
-        <w:t xml:space="preserve">When Alice and Bob exchange contact information, the DNS Handle or </w:t>
-      </w:r>
-      <w:r>
-        <w:t>Account Service Addres</w:t>
-      </w:r>
-      <w:r>
-        <w:t xml:space="preserve">s is resolved to obtain the Direct Service Address that is used to establish and authenticate the contact exchange. Once the exchange is complete, </w:t>
+        <w:t>), DNS handles and Account Service Addresses are both human friendly aliases for the Direct Service Address which provides a permanent identifier for the account and the address of the current service provider.</w:t>
+      </w:r>
+    </w:p>
+    <w:p>
+      <w:r>
+        <w:t xml:space="preserve">When Alice and Bob exchange contact information, the DNS Handle or Account Service Address is resolved to obtain the Direct Service Address that is used to establish and authenticate the contact exchange. Once the exchange is complete, </w:t>
       </w:r>
       <w:r>
         <w:t>Alice's</w:t>
@@ -2714,23 +2657,11 @@
       </w:r>
       <w:proofErr w:type="gramStart"/>
       <w:r>
-        <w:t xml:space="preserve">the </w:t>
-      </w:r>
-      <w:r>
-        <w:t>DNS</w:t>
+        <w:t>the DNS</w:t>
       </w:r>
       <w:proofErr w:type="gramEnd"/>
       <w:r>
-        <w:t xml:space="preserve"> Handle </w:t>
-      </w:r>
-      <w:r>
-        <w:t xml:space="preserve">to locate Alice's current service provider and use that to update the </w:t>
-      </w:r>
-      <w:r>
-        <w:t>Direct Service Address</w:t>
-      </w:r>
-      <w:r>
-        <w:t xml:space="preserve"> if required.</w:t>
+        <w:t xml:space="preserve"> Handle to locate Alice's current service provider and use that to update the Direct Service Address if required.</w:t>
       </w:r>
     </w:p>
     <w:p>
@@ -4336,13 +4267,7 @@
     </w:p>
     <w:p>
       <w:r>
-        <w:t xml:space="preserve">To interact with the Mesh account a device or service needs to know the account's </w:t>
-      </w:r>
-      <w:r>
-        <w:t>profile fingerprint</w:t>
-      </w:r>
-      <w:r>
-        <w:t xml:space="preserve"> and the DNS address of the current service provider.</w:t>
+        <w:t>To interact with the Mesh account a device or service needs to know the account's profile fingerprint and the DNS address of the current service provider.</w:t>
       </w:r>
       <w:r>
         <w:t xml:space="preserve"> For example, </w:t>
@@ -4532,120 +4457,142 @@
         <w:pStyle w:val="DT"/>
       </w:pPr>
       <w:r>
+        <w:t xml:space="preserve">Account Service Address (e.g. </w:t>
+      </w:r>
+      <w:r>
+        <w:rPr>
+          <w:u w:val="single"/>
+        </w:rPr>
+        <w:t>alice@example.com</w:t>
+      </w:r>
+      <w:r>
+        <w:t>)</w:t>
+      </w:r>
+    </w:p>
+    <w:p>
+      <w:pPr>
+        <w:pStyle w:val="DD"/>
+      </w:pPr>
+      <w:r>
+        <w:t>A name selected by the user or the service provider combined with the DNS address of the service provider.</w:t>
+      </w:r>
+    </w:p>
+    <w:p>
+      <w:pPr>
+        <w:pStyle w:val="DT"/>
+      </w:pPr>
+      <w:r>
         <w:t xml:space="preserve">Direct Service Address (e.g. </w:t>
       </w:r>
       <w:r>
         <w:rPr>
           <w:u w:val="single"/>
         </w:rPr>
+        <w:t>m</w:t>
+      </w:r>
+      <w:r>
+        <w:rPr>
+          <w:u w:val="single"/>
+        </w:rPr>
+        <w:t>aua-f6qe-ejui-gbwr-c4bh-4x5o-tlah@</w:t>
+      </w:r>
+      <w:r>
+        <w:rPr>
+          <w:u w:val="single"/>
+        </w:rPr>
+        <w:t>@</w:t>
+      </w:r>
+      <w:r>
+        <w:rPr>
+          <w:u w:val="single"/>
+        </w:rPr>
+        <w:t>example.com</w:t>
+      </w:r>
+      <w:r>
+        <w:t>)</w:t>
+      </w:r>
+    </w:p>
+    <w:p>
+      <w:pPr>
+        <w:pStyle w:val="DD"/>
+      </w:pPr>
+      <w:r>
+        <w:t>The profile fingerprint combined with the Service Addres</w:t>
+      </w:r>
+      <w:r>
+        <w:t>s</w:t>
+      </w:r>
+      <w:r>
+        <w:t>.</w:t>
+      </w:r>
+    </w:p>
+    <w:p>
+      <w:pPr>
+        <w:pStyle w:val="DT"/>
+      </w:pPr>
+      <w:r>
+        <w:t xml:space="preserve">Direct Account Service Address (e.g. </w:t>
+      </w:r>
+      <w:r>
+        <w:rPr>
+          <w:u w:val="single"/>
+        </w:rPr>
+        <w:t>maua-f6qe-ejui-gbwr-c4bh-4x5o-tlah@alice@example.com</w:t>
+      </w:r>
+      <w:r>
+        <w:t>)</w:t>
+      </w:r>
+    </w:p>
+    <w:p>
+      <w:pPr>
+        <w:pStyle w:val="DD"/>
+      </w:pPr>
+      <w:r>
+        <w:t>A Direct Service Address in which the account name is also specified.</w:t>
+      </w:r>
+    </w:p>
+    <w:p>
+      <w:pPr>
+        <w:pStyle w:val="DT"/>
+      </w:pPr>
+      <w:r>
+        <w:t>DNS Handle (e.</w:t>
+      </w:r>
+      <w:proofErr w:type="gramStart"/>
+      <w:r>
+        <w:t>g. @alice.example.net</w:t>
+      </w:r>
+      <w:proofErr w:type="gramEnd"/>
+      <w:r>
+        <w:t>)</w:t>
+      </w:r>
+    </w:p>
+    <w:p>
+      <w:pPr>
+        <w:pStyle w:val="DD"/>
+      </w:pPr>
+      <w:r>
+        <w:t>A DNS handle registered by the user that is bound to the Direct Service Address of the account by means of a DNS TXT record entry.</w:t>
+      </w:r>
+    </w:p>
+    <w:p>
+      <w:pPr>
+        <w:pStyle w:val="DT"/>
+      </w:pPr>
+      <w:r>
+        <w:t xml:space="preserve">Direct DNS Handle (e.g. </w:t>
+      </w:r>
+      <w:r>
+        <w:rPr>
+          <w:u w:val="single"/>
+        </w:rPr>
         <w:t>@m</w:t>
       </w:r>
       <w:r>
         <w:rPr>
           <w:u w:val="single"/>
         </w:rPr>
-        <w:t>aua-f6qe-ejui-gbwr-c4bh-4x5o-tlah@example.com</w:t>
-      </w:r>
-      <w:r>
-        <w:t>)</w:t>
-      </w:r>
-    </w:p>
-    <w:p>
-      <w:pPr>
-        <w:pStyle w:val="DD"/>
-      </w:pPr>
-      <w:r>
-        <w:t>The profile fingerprint combined with the DNS address of the service provider.</w:t>
-      </w:r>
-    </w:p>
-    <w:p>
-      <w:pPr>
-        <w:pStyle w:val="DT"/>
-      </w:pPr>
-      <w:r>
-        <w:t xml:space="preserve">Account Service Address (e.g. </w:t>
-      </w:r>
-      <w:r>
-        <w:rPr>
-          <w:u w:val="single"/>
-        </w:rPr>
-        <w:t>alice@example.com</w:t>
-      </w:r>
-      <w:r>
-        <w:t>)</w:t>
-      </w:r>
-    </w:p>
-    <w:p>
-      <w:pPr>
-        <w:pStyle w:val="DD"/>
-      </w:pPr>
-      <w:r>
-        <w:t>A name selected by the user or the service provider combined with the DNS address of the service provider.</w:t>
-      </w:r>
-    </w:p>
-    <w:p>
-      <w:pPr>
-        <w:pStyle w:val="DT"/>
-      </w:pPr>
-      <w:r>
-        <w:t xml:space="preserve">Direct Account Service Address (e.g. </w:t>
-      </w:r>
-      <w:hyperlink r:id="rId6" w:history="1">
-        <w:r>
-          <w:rPr>
-            <w:rStyle w:val="Hyperlink"/>
-          </w:rPr>
-          <w:t>maua-f6qe-ejui-gbwr-c4bh-4x5o-tlah@alice@example.com</w:t>
-        </w:r>
-      </w:hyperlink>
-      <w:r>
-        <w:t>)</w:t>
-      </w:r>
-    </w:p>
-    <w:p>
-      <w:pPr>
-        <w:pStyle w:val="DD"/>
-      </w:pPr>
-      <w:r>
-        <w:t>The profile fingerprint combined with the Direct Service Address</w:t>
-      </w:r>
-    </w:p>
-    <w:p>
-      <w:pPr>
-        <w:pStyle w:val="DT"/>
-      </w:pPr>
-      <w:r>
-        <w:t>DNS Handle (e.</w:t>
-      </w:r>
-      <w:proofErr w:type="gramStart"/>
-      <w:r>
-        <w:t>g. @alice.example.net</w:t>
-      </w:r>
-      <w:proofErr w:type="gramEnd"/>
-      <w:r>
-        <w:t>)</w:t>
-      </w:r>
-    </w:p>
-    <w:p>
-      <w:pPr>
-        <w:pStyle w:val="DD"/>
-      </w:pPr>
-      <w:r>
-        <w:t>A DNS handle registered by the user that is bound to the Direct Service Address of the account by means of a DNS TXT record entry.</w:t>
-      </w:r>
-    </w:p>
-    <w:p>
-      <w:pPr>
-        <w:pStyle w:val="DT"/>
-      </w:pPr>
-      <w:r>
-        <w:t xml:space="preserve">Direct DNS Handle (e.g. </w:t>
-      </w:r>
-      <w:r>
-        <w:rPr>
-          <w:u w:val="single"/>
-        </w:rPr>
-        <w:t>maua-f6qe-ejui-gbwr-c4bh-4x5o-tlah@</w:t>
+        <w:t>aua-f6qe-ejui-gbwr-c4bh-4x5o-tlah</w:t>
       </w:r>
       <w:r>
         <w:rPr>
@@ -9689,6 +9636,7 @@
   <w:style w:type="character" w:default="1" w:styleId="DefaultParagraphFont">
     <w:name w:val="Default Paragraph Font"/>
     <w:uiPriority w:val="1"/>
+    <w:semiHidden/>
     <w:unhideWhenUsed/>
   </w:style>
   <w:style w:type="table" w:default="1" w:styleId="TableNormal">

</xml_diff>